<commit_message>
Record claimed deployment and supplied submission URL
</commit_message>
<xml_diff>
--- a/AI_Coding_作業一/01_一步一步操作說明.docx
+++ b/AI_Coding_作業一/01_一步一步操作說明.docx
@@ -8,6 +8,11 @@
       </w:pPr>
       <w:r>
         <w:t>作業一逐步操作：建築學生作品與學習紀錄網站</w:t>
+      </w:r>
+    </w:p>
+    <w:p>
+      <w:r>
+        <w:t>最新狀態：使用者的認領頁截圖顯示部署已被認領。看到這個訊息時，請跳到 Vercel Dashboard 核對自己的專案，不用再重複點認領連結。原匿名到期時間不能用來判定認領後的保留狀態。</w:t>
       </w:r>
     </w:p>
     <w:p>
@@ -484,12 +489,12 @@
     </w:p>
     <w:p>
       <w:r>
-        <w:t>目前已用 Vercel CLI 的 vercel deploy --temporary --yes 完成臨時部署。臨時網址是 https://temporary-brisk-iodine-5xjjt8v.vercel.app ，在 2026-10-06 17:24（台北時間）到期。</w:t>
+        <w:t>目前已用 Vercel CLI 的 vercel deploy --temporary --yes 完成臨時部署。臨時網址是 https://temporary-brisk-iodine-5xjjt8v.vercel.app ；原匿名到期時間為 2026-10-06 17:24（台北時間）。最新認領頁已顯示被認領，請以 Dashboard 的專案狀態為準。</w:t>
       </w:r>
     </w:p>
     <w:p>
       <w:r>
-        <w:t>優先處理：開啟本地「私人部署資訊/Vercel認領連結.html」，登入你自己的 Vercel 帳號並依畫面認領，保留這個網站。該私用文件不在 GitHub／公開壓縮檔中。</w:t>
+        <w:t>僅在尚未被認領時：開啟本地「私人部署資訊/Vercel認領連結.html」，登入你自己的 Vercel 帳號並依畫面認領，保留這個網站。該私用文件不在 GitHub／公開壓縮檔中。</w:t>
       </w:r>
     </w:p>
     <w:p>
@@ -686,7 +691,7 @@
     </w:p>
     <w:p>
       <w:r>
-        <w:t>打開 02_作業繳交內容.md 或同名 Word 檔，將「待填：Vercel 公開網址」替換成實際網址，再貼上作品說明到作業平台。</w:t>
+        <w:t>打開 02_作業繳交內容.md 或同名 Word 檔，核對已填入的使用者提供網址；若 Dashboard 顯示其他正式網址，將其替換，再貼上作品說明到作業平台。</w:t>
       </w:r>
     </w:p>
     <w:p>

</xml_diff>